<commit_message>
update core and system to v0.2.1
</commit_message>
<xml_diff>
--- a/commands_list.docx
+++ b/commands_list.docx
@@ -8,6 +8,7 @@
         <w:rPr>
           <w:sz w:val="32"/>
           <w:szCs w:val="32"/>
+          <w:lang w:val="ru-RU"/>
         </w:rPr>
       </w:pPr>
       <w:r>
@@ -35,8 +36,9 @@
         <w:rPr>
           <w:sz w:val="32"/>
           <w:szCs w:val="32"/>
+          <w:lang w:val="ru-RU"/>
         </w:rPr>
-        <w:t>0</w:t>
+        <w:t>1</w:t>
       </w:r>
     </w:p>
     <w:p>
@@ -167,29 +169,17 @@
         <w:rPr>
           <w:sz w:val="32"/>
           <w:szCs w:val="32"/>
+          <w:lang w:val="ru-RU"/>
         </w:rPr>
-        <w:t>0.</w:t>
+        <w:t>0.2.</w:t>
       </w:r>
       <w:r>
         <w:rPr>
           <w:sz w:val="32"/>
           <w:szCs w:val="32"/>
+          <w:lang w:val="ru-RU"/>
         </w:rPr>
-        <w:t>2</w:t>
-      </w:r>
-      <w:r>
-        <w:rPr>
-          <w:sz w:val="32"/>
-          <w:szCs w:val="32"/>
-        </w:rPr>
-        <w:t>.</w:t>
-      </w:r>
-      <w:r>
-        <w:rPr>
-          <w:sz w:val="32"/>
-          <w:szCs w:val="32"/>
-        </w:rPr>
-        <w:t>0</w:t>
+        <w:t>1</w:t>
       </w:r>
       <w:r>
         <w:rPr>
@@ -470,8 +460,13 @@
             </w:r>
             <w:r>
               <w:br/>
-              <w:t>cd ..</w:t>
+              <w:t>cd</w:t>
             </w:r>
+            <w:proofErr w:type="gramStart"/>
+            <w:r>
+              <w:t xml:space="preserve"> ..</w:t>
+            </w:r>
+            <w:proofErr w:type="gramEnd"/>
           </w:p>
         </w:tc>
       </w:tr>
@@ -813,8 +808,6 @@
             </w:r>
             <w:r>
               <w:br/>
-            </w:r>
-            <w:r>
               <w:t>help</w:t>
             </w:r>
           </w:p>
@@ -861,8 +854,6 @@
             </w:r>
             <w:r>
               <w:br/>
-            </w:r>
-            <w:r>
               <w:t>help</w:t>
             </w:r>
           </w:p>
@@ -909,8 +900,6 @@
             </w:r>
             <w:r>
               <w:br/>
-            </w:r>
-            <w:r>
               <w:t>help</w:t>
             </w:r>
           </w:p>
@@ -976,8 +965,6 @@
             </w:r>
             <w:r>
               <w:br/>
-            </w:r>
-            <w:r>
               <w:t>help</w:t>
             </w:r>
           </w:p>
@@ -1446,19 +1433,7 @@
           <w:rPr>
             <w:rStyle w:val="aff8"/>
           </w:rPr>
-          <w:t>https://github.com/VLPLAY-Games/XenoOS/blob/</w:t>
-        </w:r>
-        <w:r>
-          <w:rPr>
-            <w:rStyle w:val="aff8"/>
-          </w:rPr>
-          <w:t>m</w:t>
-        </w:r>
-        <w:r>
-          <w:rPr>
-            <w:rStyle w:val="aff8"/>
-          </w:rPr>
-          <w:t>ain/LICENSE</w:t>
+          <w:t>https://github.com/VLPLAY-Games/XenoOS/blob/main/LICENSE</w:t>
         </w:r>
       </w:hyperlink>
       <w:r>

</xml_diff>